<commit_message>
restore local work after updating main
</commit_message>
<xml_diff>
--- a/Final report.docx
+++ b/Final report.docx
@@ -17033,13 +17033,13 @@
         <w:tblLook w:val="04A0" w:firstRow="1" w:lastRow="0" w:firstColumn="1" w:lastColumn="0" w:noHBand="0" w:noVBand="1"/>
       </w:tblPr>
       <w:tblGrid>
-        <w:gridCol w:w="1063"/>
-        <w:gridCol w:w="1130"/>
-        <w:gridCol w:w="1074"/>
-        <w:gridCol w:w="1018"/>
-        <w:gridCol w:w="1024"/>
-        <w:gridCol w:w="1365"/>
-        <w:gridCol w:w="1262"/>
+        <w:gridCol w:w="1061"/>
+        <w:gridCol w:w="1127"/>
+        <w:gridCol w:w="1070"/>
+        <w:gridCol w:w="1012"/>
+        <w:gridCol w:w="1017"/>
+        <w:gridCol w:w="1397"/>
+        <w:gridCol w:w="1252"/>
       </w:tblGrid>
       <w:tr>
         <w:tc>
@@ -18096,13 +18096,13 @@
         <w:tblLook w:val="04A0" w:firstRow="1" w:lastRow="0" w:firstColumn="1" w:lastColumn="0" w:noHBand="0" w:noVBand="1"/>
       </w:tblPr>
       <w:tblGrid>
-        <w:gridCol w:w="1077"/>
-        <w:gridCol w:w="1053"/>
-        <w:gridCol w:w="1053"/>
-        <w:gridCol w:w="1061"/>
-        <w:gridCol w:w="1067"/>
-        <w:gridCol w:w="1413"/>
-        <w:gridCol w:w="1212"/>
+        <w:gridCol w:w="1076"/>
+        <w:gridCol w:w="1049"/>
+        <w:gridCol w:w="1049"/>
+        <w:gridCol w:w="1056"/>
+        <w:gridCol w:w="1063"/>
+        <w:gridCol w:w="1441"/>
+        <w:gridCol w:w="1202"/>
       </w:tblGrid>
       <w:tr>
         <w:tc>
@@ -21925,6 +21925,241 @@
     <w:p>
       <w:pPr>
         <w:pStyle w:val="ListParagraph"/>
+        <w:numPr>
+          <w:ilvl w:val="1"/>
+          <w:numId w:val="4"/>
+        </w:numPr>
+        <w:rPr>
+          <w:lang w:val="en-US"/>
+        </w:rPr>
+      </w:pPr>
+      <w:proofErr w:type="spellStart"/>
+      <w:r>
+        <w:rPr>
+          <w:lang w:val="en-US"/>
+        </w:rPr>
+        <w:t>Thiết</w:t>
+      </w:r>
+      <w:proofErr w:type="spellEnd"/>
+      <w:r>
+        <w:rPr>
+          <w:lang w:val="en-US"/>
+        </w:rPr>
+        <w:t xml:space="preserve"> </w:t>
+      </w:r>
+      <w:proofErr w:type="spellStart"/>
+      <w:r>
+        <w:rPr>
+          <w:lang w:val="en-US"/>
+        </w:rPr>
+        <w:t>kế</w:t>
+      </w:r>
+      <w:proofErr w:type="spellEnd"/>
+      <w:r>
+        <w:rPr>
+          <w:lang w:val="en-US"/>
+        </w:rPr>
+        <w:t xml:space="preserve"> </w:t>
+      </w:r>
+      <w:proofErr w:type="spellStart"/>
+      <w:r>
+        <w:rPr>
+          <w:lang w:val="en-US"/>
+        </w:rPr>
+        <w:t>và</w:t>
+      </w:r>
+      <w:proofErr w:type="spellEnd"/>
+      <w:r>
+        <w:rPr>
+          <w:lang w:val="en-US"/>
+        </w:rPr>
+        <w:t xml:space="preserve"> </w:t>
+      </w:r>
+      <w:proofErr w:type="spellStart"/>
+      <w:r>
+        <w:rPr>
+          <w:lang w:val="en-US"/>
+        </w:rPr>
+        <w:t>cài</w:t>
+      </w:r>
+      <w:proofErr w:type="spellEnd"/>
+      <w:r>
+        <w:rPr>
+          <w:lang w:val="en-US"/>
+        </w:rPr>
+        <w:t xml:space="preserve"> </w:t>
+      </w:r>
+      <w:proofErr w:type="spellStart"/>
+      <w:r>
+        <w:rPr>
+          <w:lang w:val="en-US"/>
+        </w:rPr>
+        <w:t>đặt</w:t>
+      </w:r>
+      <w:proofErr w:type="spellEnd"/>
+    </w:p>
+    <w:p>
+      <w:pPr>
+        <w:pStyle w:val="ListParagraph"/>
+        <w:numPr>
+          <w:ilvl w:val="1"/>
+          <w:numId w:val="24"/>
+        </w:numPr>
+        <w:rPr>
+          <w:lang w:val="en-US"/>
+        </w:rPr>
+      </w:pPr>
+      <w:r>
+        <w:rPr>
+          <w:lang w:val="en-US"/>
+        </w:rPr>
+        <w:t>CMD</w:t>
+      </w:r>
+    </w:p>
+    <w:p>
+      <w:pPr>
+        <w:pStyle w:val="ListParagraph"/>
+        <w:numPr>
+          <w:ilvl w:val="1"/>
+          <w:numId w:val="24"/>
+        </w:numPr>
+        <w:rPr>
+          <w:lang w:val="en-US"/>
+        </w:rPr>
+      </w:pPr>
+      <w:r>
+        <w:rPr>
+          <w:lang w:val="en-US"/>
+        </w:rPr>
+        <w:t>GUI</w:t>
+      </w:r>
+    </w:p>
+    <w:p>
+      <w:pPr>
+        <w:pStyle w:val="ListParagraph"/>
+        <w:numPr>
+          <w:ilvl w:val="1"/>
+          <w:numId w:val="24"/>
+        </w:numPr>
+        <w:rPr>
+          <w:lang w:val="en-US"/>
+        </w:rPr>
+      </w:pPr>
+      <w:proofErr w:type="spellStart"/>
+      <w:r>
+        <w:rPr>
+          <w:lang w:val="en-US"/>
+        </w:rPr>
+        <w:t>Thiết</w:t>
+      </w:r>
+      <w:proofErr w:type="spellEnd"/>
+      <w:r>
+        <w:rPr>
+          <w:lang w:val="en-US"/>
+        </w:rPr>
+        <w:t xml:space="preserve"> </w:t>
+      </w:r>
+      <w:proofErr w:type="spellStart"/>
+      <w:r>
+        <w:rPr>
+          <w:lang w:val="en-US"/>
+        </w:rPr>
+        <w:t>kế</w:t>
+      </w:r>
+      <w:proofErr w:type="spellEnd"/>
+      <w:r>
+        <w:rPr>
+          <w:lang w:val="en-US"/>
+        </w:rPr>
+        <w:t xml:space="preserve"> </w:t>
+      </w:r>
+      <w:proofErr w:type="spellStart"/>
+      <w:r>
+        <w:rPr>
+          <w:lang w:val="en-US"/>
+        </w:rPr>
+        <w:t>và</w:t>
+      </w:r>
+      <w:proofErr w:type="spellEnd"/>
+      <w:r>
+        <w:rPr>
+          <w:lang w:val="en-US"/>
+        </w:rPr>
+        <w:t xml:space="preserve"> </w:t>
+      </w:r>
+      <w:proofErr w:type="spellStart"/>
+      <w:r>
+        <w:rPr>
+          <w:lang w:val="en-US"/>
+        </w:rPr>
+        <w:t>cài</w:t>
+      </w:r>
+      <w:proofErr w:type="spellEnd"/>
+      <w:r>
+        <w:rPr>
+          <w:lang w:val="en-US"/>
+        </w:rPr>
+        <w:t xml:space="preserve"> </w:t>
+      </w:r>
+      <w:proofErr w:type="spellStart"/>
+      <w:r>
+        <w:rPr>
+          <w:lang w:val="en-US"/>
+        </w:rPr>
+        <w:t>đặt</w:t>
+      </w:r>
+      <w:proofErr w:type="spellEnd"/>
+      <w:r>
+        <w:rPr>
+          <w:lang w:val="en-US"/>
+        </w:rPr>
+        <w:t xml:space="preserve"> </w:t>
+      </w:r>
+      <w:proofErr w:type="spellStart"/>
+      <w:r>
+        <w:rPr>
+          <w:lang w:val="en-US"/>
+        </w:rPr>
+        <w:t>trong</w:t>
+      </w:r>
+      <w:proofErr w:type="spellEnd"/>
+      <w:r>
+        <w:rPr>
+          <w:lang w:val="en-US"/>
+        </w:rPr>
+        <w:t xml:space="preserve"> code</w:t>
+      </w:r>
+    </w:p>
+    <w:p>
+      <w:pPr>
+        <w:ind w:left="1080"/>
+        <w:rPr>
+          <w:lang w:val="en-US"/>
+        </w:rPr>
+      </w:pPr>
+      <w:r>
+        <w:rPr>
+          <w:lang w:val="en-US"/>
+        </w:rPr>
+        <w:t xml:space="preserve">2. </w:t>
+      </w:r>
+      <w:proofErr w:type="spellStart"/>
+      <w:r>
+        <w:rPr>
+          <w:lang w:val="en-US"/>
+        </w:rPr>
+        <w:t>Corectness</w:t>
+      </w:r>
+      <w:proofErr w:type="spellEnd"/>
+      <w:r>
+        <w:rPr>
+          <w:lang w:val="en-US"/>
+        </w:rPr>
+        <w:t xml:space="preserve"> &amp; Negative Tests</w:t>
+      </w:r>
+    </w:p>
+    <w:p>
+      <w:pPr>
         <w:ind w:left="1080"/>
         <w:rPr>
           <w:lang w:val="en-US"/>
@@ -24583,6 +24818,119 @@
       <w:pPr>
         <w:ind w:left="6480" w:hanging="180"/>
       </w:pPr>
+    </w:lvl>
+  </w:abstractNum>
+  <w:abstractNum w:abstractNumId="23" w15:restartNumberingAfterBreak="0">
+    <w:nsid w:val="790927CE"/>
+    <w:multiLevelType w:val="multilevel"/>
+    <w:tmpl w:val="7682FF5C"/>
+    <w:lvl w:ilvl="0">
+      <w:start w:val="1"/>
+      <w:numFmt w:val="decimal"/>
+      <w:lvlText w:val="%1."/>
+      <w:lvlJc w:val="left"/>
+      <w:pPr>
+        <w:ind w:left="408" w:hanging="408"/>
+      </w:pPr>
+      <w:rPr>
+        <w:rFonts w:hint="default"/>
+      </w:rPr>
+    </w:lvl>
+    <w:lvl w:ilvl="1">
+      <w:start w:val="1"/>
+      <w:numFmt w:val="decimal"/>
+      <w:lvlText w:val="%1.%2."/>
+      <w:lvlJc w:val="left"/>
+      <w:pPr>
+        <w:ind w:left="1800" w:hanging="720"/>
+      </w:pPr>
+      <w:rPr>
+        <w:rFonts w:hint="default"/>
+      </w:rPr>
+    </w:lvl>
+    <w:lvl w:ilvl="2">
+      <w:start w:val="1"/>
+      <w:numFmt w:val="decimal"/>
+      <w:lvlText w:val="%1.%2.%3."/>
+      <w:lvlJc w:val="left"/>
+      <w:pPr>
+        <w:ind w:left="2880" w:hanging="720"/>
+      </w:pPr>
+      <w:rPr>
+        <w:rFonts w:hint="default"/>
+      </w:rPr>
+    </w:lvl>
+    <w:lvl w:ilvl="3">
+      <w:start w:val="1"/>
+      <w:numFmt w:val="decimal"/>
+      <w:lvlText w:val="%1.%2.%3.%4."/>
+      <w:lvlJc w:val="left"/>
+      <w:pPr>
+        <w:ind w:left="4320" w:hanging="1080"/>
+      </w:pPr>
+      <w:rPr>
+        <w:rFonts w:hint="default"/>
+      </w:rPr>
+    </w:lvl>
+    <w:lvl w:ilvl="4">
+      <w:start w:val="1"/>
+      <w:numFmt w:val="decimal"/>
+      <w:lvlText w:val="%1.%2.%3.%4.%5."/>
+      <w:lvlJc w:val="left"/>
+      <w:pPr>
+        <w:ind w:left="5400" w:hanging="1080"/>
+      </w:pPr>
+      <w:rPr>
+        <w:rFonts w:hint="default"/>
+      </w:rPr>
+    </w:lvl>
+    <w:lvl w:ilvl="5">
+      <w:start w:val="1"/>
+      <w:numFmt w:val="decimal"/>
+      <w:lvlText w:val="%1.%2.%3.%4.%5.%6."/>
+      <w:lvlJc w:val="left"/>
+      <w:pPr>
+        <w:ind w:left="6840" w:hanging="1440"/>
+      </w:pPr>
+      <w:rPr>
+        <w:rFonts w:hint="default"/>
+      </w:rPr>
+    </w:lvl>
+    <w:lvl w:ilvl="6">
+      <w:start w:val="1"/>
+      <w:numFmt w:val="decimal"/>
+      <w:lvlText w:val="%1.%2.%3.%4.%5.%6.%7."/>
+      <w:lvlJc w:val="left"/>
+      <w:pPr>
+        <w:ind w:left="7920" w:hanging="1440"/>
+      </w:pPr>
+      <w:rPr>
+        <w:rFonts w:hint="default"/>
+      </w:rPr>
+    </w:lvl>
+    <w:lvl w:ilvl="7">
+      <w:start w:val="1"/>
+      <w:numFmt w:val="decimal"/>
+      <w:lvlText w:val="%1.%2.%3.%4.%5.%6.%7.%8."/>
+      <w:lvlJc w:val="left"/>
+      <w:pPr>
+        <w:ind w:left="9360" w:hanging="1800"/>
+      </w:pPr>
+      <w:rPr>
+        <w:rFonts w:hint="default"/>
+      </w:rPr>
+    </w:lvl>
+    <w:lvl w:ilvl="8">
+      <w:start w:val="1"/>
+      <w:numFmt w:val="decimal"/>
+      <w:lvlText w:val="%1.%2.%3.%4.%5.%6.%7.%8.%9."/>
+      <w:lvlJc w:val="left"/>
+      <w:pPr>
+        <w:ind w:left="10800" w:hanging="2160"/>
+      </w:pPr>
+      <w:rPr>
+        <w:rFonts w:hint="default"/>
+      </w:rPr>
     </w:lvl>
   </w:abstractNum>
   <w:num w:numId="1" w16cid:durableId="1683388546">
@@ -24653,6 +25001,9 @@
   </w:num>
   <w:num w:numId="23" w16cid:durableId="743064243">
     <w:abstractNumId w:val="12"/>
+  </w:num>
+  <w:num w:numId="24" w16cid:durableId="2034768397">
+    <w:abstractNumId w:val="23"/>
   </w:num>
 </w:numbering>
 </file>
@@ -25261,7 +25612,6 @@
   <w:style w:type="character" w:default="1" w:styleId="DefaultParagraphFont">
     <w:name w:val="Default Paragraph Font"/>
     <w:uiPriority w:val="1"/>
-    <w:semiHidden/>
     <w:unhideWhenUsed/>
   </w:style>
   <w:style w:type="table" w:default="1" w:styleId="TableNormal">

</xml_diff>